<commit_message>
Prowizja Finance You 5% w dokumentach prawnych (regulamin v3, pakiet v7, klauzula umowy, cennik)
Regenerowane skryptami build-zgody-v3 / build-pakiet-v7 (docx, sha256, migracja
20260930190000 + lustro drizzle 0024). Testy dostosowane.

Co-Authored-By: Claude Sonnet 5.5 <noreply@anthropic.com>
Claude-Session: https://claude.ai/code/session_013SwJrnc1zV2fJwfRKt4pWE
</commit_message>
<xml_diff>
--- a/docs/legal/paczka-inwestor-v7/02_Ramowa_umowa_posrednictwa_na_odleglosc_Finance_You_v7.docx
+++ b/docs/legal/paczka-inwestor-v7/02_Ramowa_umowa_posrednictwa_na_odleglosc_Finance_You_v7.docx
@@ -362,7 +362,7 @@
         <w:jc w:val="both"/>
       </w:pPr>
       <w:r>
-        <w:t xml:space="preserve">Model rozliczenia.  Finance You nie pobiera od Inwestora wynagrodzenia z Umowy; dostęp do systemu wymaga aktywnego Abonamentu (Regulamin Abonamentu Inwestora, obecnie 1 500,00 zł brutto za 30 dni albo 7 000,00 zł brutto za 365 dni). Klient płaci Prowizję od Pożyczkobiorcy według odrębnej umowy (7% Kwoty Udzielonej, nie mniej niż 5 000,00 zł, bez VAT), a Inwestor zabezpiecza jej bezpośredni przelew z kwoty Finansowania i potrąca ją z wypłaty. Zawarcie lub wykonanie Transakcji Chronionej bez tego mechanizmu stanowi Naruszenie Obejściowe i uruchamia Karę Obejściową równą 5% Sumy Hipotecznej.</w:t>
+        <w:t xml:space="preserve">Model rozliczenia.  Finance You nie pobiera od Inwestora wynagrodzenia z Umowy; dostęp do systemu wymaga aktywnego Abonamentu (Regulamin Abonamentu Inwestora, obecnie 1 500,00 zł brutto za 30 dni albo 7 000,00 zł brutto za 365 dni). Klient płaci Prowizję od Pożyczkobiorcy według odrębnej umowy (5% Kwoty Udzielonej, nie mniej niż 5 000,00 zł, bez VAT), a Inwestor zabezpiecza jej bezpośredni przelew z kwoty Finansowania i potrąca ją z wypłaty. Zawarcie lub wykonanie Transakcji Chronionej bez tego mechanizmu stanowi Naruszenie Obejściowe i uruchamia Karę Obejściową równą 5% Sumy Hipotecznej.</w:t>
       </w:r>
     </w:p>
     <w:p>
@@ -474,7 +474,7 @@
         <w:jc w:val="both"/>
       </w:pPr>
       <w:r>
-        <w:t xml:space="preserve">Prowizja od Pożyczkobiorcy oznacza odrębne wynagrodzenie Finance You wynikające wyłącznie z umowy z Klientem i ekonomicznie obciążające Klienta, a nie cenę usługi świadczonej Inwestorowi. Wynosi 7% Kwoty Udzielonej, nie mniej niż 5 000,00 zł, bez VAT, i jest potrącana z wypłaty Finansowania zgodnie z dyspozycją Klienta (Załącznik nr 6): Inwestor przekazuje ją bezpośrednio na rachunek Finance You, a pozostałą część Kwoty Udzielonej wypłaca Klientowi; jeżeli odrębna umowa z Klientem przewiduje inną stawkę, minimum albo podstawę, Karta Leada musi odzwierciedlać rzeczywiste warunki tej umowy.</w:t>
+        <w:t xml:space="preserve">Prowizja od Pożyczkobiorcy oznacza odrębne wynagrodzenie Finance You wynikające wyłącznie z umowy z Klientem i ekonomicznie obciążające Klienta, a nie cenę usługi świadczonej Inwestorowi. Wynosi 5% Kwoty Udzielonej, nie mniej niż 5 000,00 zł, bez VAT, i jest potrącana z wypłaty Finansowania zgodnie z dyspozycją Klienta (Załącznik nr 6): Inwestor przekazuje ją bezpośrednio na rachunek Finance You, a pozostałą część Kwoty Udzielonej wypłaca Klientowi; jeżeli odrębna umowa z Klientem przewiduje inną stawkę, minimum albo podstawę, Karta Leada musi odzwierciedlać rzeczywiste warunki tej umowy.</w:t>
       </w:r>
     </w:p>
     <w:p>
@@ -1047,7 +1047,7 @@
         <w:jc w:val="both"/>
       </w:pPr>
       <w:r>
-        <w:t xml:space="preserve">Ekonomiczny ciężar Prowizji od Pożyczkobiorcy ponosi Klient na podstawie odrębnej umowy z Finance You; nie jest ona opłatą za usługę świadczoną Inwestorowi. Prowizja od Pożyczkobiorcy wynosi 7% Kwoty Udzielonej, nie mniej niż 5 000,00 zł, bez VAT, i jest potrącana z wypłaty, chyba że umowa Klienta przewiduje inną stawkę, minimum, podstawę albo moment należności. Karta Leada musi odzwierciedlać rzeczywiste, a nie przykładowe warunki. Odrębny obowiązek Inwestora wykonania dyspozycji Klienta i świadczenia na rzecz Finance You powstaje z dokumentu Finansowania zawierającego Mechanizm Zabezpieczenia Prowizji.</w:t>
+        <w:t xml:space="preserve">Ekonomiczny ciężar Prowizji od Pożyczkobiorcy ponosi Klient na podstawie odrębnej umowy z Finance You; nie jest ona opłatą za usługę świadczoną Inwestorowi. Prowizja od Pożyczkobiorcy wynosi 5% Kwoty Udzielonej, nie mniej niż 5 000,00 zł, bez VAT, i jest potrącana z wypłaty, chyba że umowa Klienta przewiduje inną stawkę, minimum, podstawę albo moment należności. Karta Leada musi odzwierciedlać rzeczywiste, a nie przykładowe warunki. Odrębny obowiązek Inwestora wykonania dyspozycji Klienta i świadczenia na rzecz Finance You powstaje z dokumentu Finansowania zawierającego Mechanizm Zabezpieczenia Prowizji.</w:t>
       </w:r>
     </w:p>
     <w:p>
@@ -2325,7 +2325,7 @@
         <w:jc w:val="both"/>
       </w:pPr>
       <w:r>
-        <w:t xml:space="preserve">Rzeczywiste warunki z odrębnej umowy Klienta: ______ % Kwoty Udzielonej; minimum: __________ zł; bez VAT; kwota / formuła: __________________; potrącana z wypłaty: ☐ tak; moment należności: __________________Standard, jeżeli umowa Klienta nie stanowi inaczej: 7% Kwoty Udzielonej, minimum 5 000,00 zł, bez VAT.</w:t>
+        <w:t xml:space="preserve">Rzeczywiste warunki z odrębnej umowy Klienta: ______ % Kwoty Udzielonej; minimum: __________ zł; bez VAT; kwota / formuła: __________________; potrącana z wypłaty: ☐ tak; moment należności: __________________Standard, jeżeli umowa Klienta nie stanowi inaczej: 5% Kwoty Udzielonej, minimum 5 000,00 zł, bez VAT.</w:t>
       </w:r>
     </w:p>
     <w:p>
@@ -3137,7 +3137,7 @@
         <w:jc w:val="both"/>
       </w:pPr>
       <w:r>
-        <w:t xml:space="preserve">Finance You otrzymuje od Klienta Prowizję od Pożyczkobiorcy według odrębnej umowy. Standardowo: 7% Kwoty Udzielonej, nie mniej niż 5 000,00 zł, bez VAT — potrącana z wypłaty. Inwestor przekazuje ją z kwoty Finansowania bezpośrednio Finance You zgodnie z dyspozycją Klienta; nie jest to opłata Inwestora.</w:t>
+        <w:t xml:space="preserve">Finance You otrzymuje od Klienta Prowizję od Pożyczkobiorcy według odrębnej umowy. Standardowo: 5% Kwoty Udzielonej, nie mniej niż 5 000,00 zł, bez VAT — potrącana z wypłaty. Inwestor przekazuje ją z kwoty Finansowania bezpośrednio Finance You zgodnie z dyspozycją Klienta; nie jest to opłata Inwestora.</w:t>
       </w:r>
     </w:p>
     <w:p>
@@ -4472,7 +4472,7 @@
         <w:jc w:val="left"/>
       </w:pPr>
       <w:r>
-        <w:t xml:space="preserve">☐ Zlecenie składam na podstawie Ramowej umowy pośrednictwa (wersja: ________). Wiem, że nie płacę Finance You za Projekty ani od rezultatu, a dostęp do systemu wymaga aktywnego Abonamentu (Regulamin Abonamentu Inwestora); Prowizja od Pożyczkobiorcy (7% Kwoty Udzielonej, nie mniej niż 5 000,00 zł, bez VAT) obciąża Klienta, jest potrącana z wypłaty i podlega Mechanizmowi Zabezpieczenia Prowizji. ☐ Zobowiązuję się przed zawarciem Transakcji Chronionej samodzielnie zweryfikować status przedsiębiorcy Klienta i Cel Gospodarczy (§ 6 ust. 1 pkt 9). ☐ Przyjmuję do wiadomości, że Projekty są przedstawiane wyłącznie w wykonaniu przyjętego Zlecenia i nie mam dostępu do Projektów nieprzypisanych do moich Zleceń.</w:t>
+        <w:t xml:space="preserve">☐ Zlecenie składam na podstawie Ramowej umowy pośrednictwa (wersja: ________). Wiem, że nie płacę Finance You za Projekty ani od rezultatu, a dostęp do systemu wymaga aktywnego Abonamentu (Regulamin Abonamentu Inwestora); Prowizja od Pożyczkobiorcy (5% Kwoty Udzielonej, nie mniej niż 5 000,00 zł, bez VAT) obciąża Klienta, jest potrącana z wypłaty i podlega Mechanizmowi Zabezpieczenia Prowizji. ☐ Zobowiązuję się przed zawarciem Transakcji Chronionej samodzielnie zweryfikować status przedsiębiorcy Klienta i Cel Gospodarczy (§ 6 ust. 1 pkt 9). ☐ Przyjmuję do wiadomości, że Projekty są przedstawiane wyłącznie w wykonaniu przyjętego Zlecenia i nie mam dostępu do Projektów nieprzypisanych do moich Zleceń.</w:t>
       </w:r>
     </w:p>
     <w:p>

</xml_diff>